<commit_message>
ccahnge long - to regulars and add gitignore
</commit_message>
<xml_diff>
--- a/Assignment2/Report.docx
+++ b/Assignment2/Report.docx
@@ -79,7 +79,7 @@
           <w:rFonts w:ascii="Calibri" w:hAnsi="Calibri"/>
           <w:sz w:val="24"/>
         </w:rPr>
-        <w:t xml:space="preserve">: same epoch ceiling (EPOCHS = 60) and same early-stop patience (15 epochs without val-AUC improvement) for every configuration in Experiments 1 and 2. We adopted epochs rather than FLOPs because the input pipeline and image size are identical across configurations, making epochs a fair proxy; early stopping prevents fast configs from being penalised by an unnecessarily long ceiling and prevents slow configs from reading as 'diverging' when they were just under-trained. </w:t>
+        <w:t xml:space="preserve">: same epoch ceiling (EPOCHS = 60) and same early-stop patience (15 epochs without val-AUC improvement) for every configuration in Experiments 1 and 2. We adopted epochs rather than FLOPs because the input pipeline and image size are identical across configurations, making epochs a fair proxy, early stopping prevents fast configs from being penalised by an unnecessarily long ceiling and prevents slow configs from reading as 'diverging' when they were just under-trained. </w:t>
       </w:r>
       <w:r>
         <w:rPr>
@@ -94,7 +94,7 @@
           <w:rFonts w:ascii="Calibri" w:hAnsi="Calibri"/>
           <w:sz w:val="24"/>
         </w:rPr>
-        <w:t xml:space="preserve">: K = 4 trials per configuration, spent entirely on the margin (we did not also sweep the learning rate; we fixed Adam at lr = 1e-3 across all configs). </w:t>
+        <w:t xml:space="preserve">: K = 4 trials per configuration, spent entirely on the margin (we did not also sweep the learning rate, we fixed Adam at lr = 1e-3 across all configs). </w:t>
       </w:r>
       <w:r>
         <w:rPr>
@@ -139,7 +139,7 @@
           <w:rFonts w:ascii="Calibri" w:hAnsi="Calibri"/>
           <w:sz w:val="24"/>
         </w:rPr>
-        <w:t>: SEED = 42 for headline single-run numbers; SEEDS = (0, 1, 2) for the multi-seed re-runs of the best model per experiment.</w:t>
+        <w:t>: SEED = 42 for headline single-run numbers, SEEDS = (0, 1, 2) for the multi-seed re-runs of the best model per experiment.</w:t>
       </w:r>
     </w:p>
     <w:p>
@@ -222,7 +222,7 @@
           <w:rFonts w:ascii="Calibri" w:hAnsi="Calibri"/>
           <w:sz w:val="24"/>
         </w:rPr>
-        <w:t xml:space="preserve"> validation negatives by sampling pairs of distinct val identities until the count matches val positives. Final split: train +978 / −887, val +122 / −122, train/val identity overlap = 0.</w:t>
+        <w:t xml:space="preserve"> validation negatives by sampling pairs of distinct val identities until the count matches val positives. Final split: train +978 / -887, val +122 / -122, train/val identity overlap = 0.</w:t>
       </w:r>
     </w:p>
     <w:p>
@@ -350,7 +350,7 @@
           <w:rFonts w:ascii="Calibri" w:hAnsi="Calibri"/>
           <w:sz w:val="24"/>
         </w:rPr>
-        <w:t xml:space="preserve"> With K = 4 trials per configuration available, we spent the budget on the loss margins, which we judged (and the literature confirms) have the largest single effect on training stability for metric losses. Adam was fixed at lr = 1e-3 with no schedule. Margin grids: contrastive {0.5, 1.0, 1.5, 2.0} on L2-normalised embeddings (effective range [0, 2]); triplet {0.1, 0.2, 0.3, 0.5} around the FaceNet default α = 0.2. Each trial ran for EPOCHS/3 = 20 epochs (short-schedule sweep), and the margin with the best validation verification accuracy was retrained for the full budget. The sweep chose </w:t>
+        <w:t xml:space="preserve"> With K = 4 trials per configuration available, we spent the budget on the loss margins, which we judged (and the literature confirms) have the largest single effect on training stability for metric losses. Adam was fixed at lr = 1e-3 with no schedule. Margin grids: contrastive {0.5, 1.0, 1.5, 2.0} on L2-normalised embeddings (effective range [0, 2]), triplet {0.1, 0.2, 0.3, 0.5} around the FaceNet default α = 0.2. Each trial ran for EPOCHS/3 = 20 epochs (short-schedule sweep), and the margin with the best validation verification accuracy was retrained for the full budget. The sweep chose </w:t>
       </w:r>
       <w:r>
         <w:rPr>
@@ -437,7 +437,7 @@
           <w:rFonts w:ascii="Calibri" w:hAnsi="Calibri"/>
           <w:sz w:val="24"/>
         </w:rPr>
-        <w:t xml:space="preserve"> The original identity-filter retained only 13 val negatives; val-AUC became too noisy to use for model selection or threshold choice. We rebalanced by regenerating val negatives within val identities. After the fix, the val→test AUC gap for the best model dropped from ~0.11 to ~0.01.</w:t>
+        <w:t xml:space="preserve"> The original identity-filter retained only 13 val negatives, val-AUC became too noisy to use for model selection or threshold choice. We rebalanced by regenerating val negatives within val identities. After the fix, the val→test AUC gap for the best model dropped from ~0.11 to ~0.01.</w:t>
       </w:r>
     </w:p>
     <w:p>
@@ -457,7 +457,7 @@
           <w:rFonts w:ascii="Calibri" w:hAnsi="Calibri"/>
           <w:sz w:val="24"/>
         </w:rPr>
-        <w:t xml:space="preserve"> Initially 10. Triplet runs with strict-skip semi-hard mining have a sparse-gradient warm-up phase that can stall val-AUC for several epochs; we raised patience to 15 to avoid stopping before the in-batch semi-hard window populates.</w:t>
+        <w:t xml:space="preserve"> Initially 10. Triplet runs with strict-skip semi-hard mining have a sparse-gradient warm-up phase that can stall val-AUC for several epochs, we raised patience to 15 to avoid stopping before the in-batch semi-hard window populates.</w:t>
       </w:r>
     </w:p>
     <w:p>
@@ -474,7 +474,7 @@
           <w:rFonts w:ascii="Calibri" w:hAnsi="Calibri"/>
           <w:sz w:val="24"/>
         </w:rPr>
-        <w:t xml:space="preserve"> Verification accuracy is reported at the threshold that maximises Youden's J statistic (TPR − FPR) on the validation ROC; the test set is never used to pick the threshold. Same protocol for every model (Koch BCE uses P(same) from the head; contrastive and triplet use negative L2 distance on L2-normalised embeddings; frozen ImageNet uses cosine similarity).</w:t>
+        <w:t xml:space="preserve"> Verification accuracy is reported at the threshold that maximises Youden's J statistic (TPR - FPR) on the validation ROC, the test set is never used to pick the threshold. Same protocol for every model (Koch BCE uses P(same) from the head, contrastive and triplet use negative L2 distance on L2-normalised embeddings, frozen ImageNet uses cosine similarity).</w:t>
       </w:r>
     </w:p>
     <w:p>
@@ -491,7 +491,7 @@
           <w:rFonts w:ascii="Calibri" w:hAnsi="Calibri"/>
           <w:sz w:val="24"/>
         </w:rPr>
-        <w:t xml:space="preserve"> 250 episodes per N ∈ {2, 5, 20}, built once with SEED = 42 from test identities only and shared across every model. Each episode is (query, [N supports], correct_idx); the model is correct iff the same-identity support has the highest similarity to the query.</w:t>
+        <w:t xml:space="preserve"> 250 episodes per N ∈ {2, 5, 20}, built once with SEED = 42 from test identities only and shared across every model. Each episode is (query, [N supports], correct_idx), the model is correct iff the same-identity support has the highest similarity to the query.</w:t>
       </w:r>
     </w:p>
     <w:p>
@@ -561,7 +561,7 @@
           <w:rFonts w:ascii="Calibri" w:hAnsi="Calibri"/>
           <w:sz w:val="24"/>
         </w:rPr>
-        <w:t xml:space="preserve"> learns a scalar similarity directly through a Linear(EMBED_DIM, 1) head on the elementwise |z_a − z_b|; the embedding space has no native metric, only the post-hoc weighted-L1 head ranks pairs. </w:t>
+        <w:t xml:space="preserve"> learns a scalar similarity directly through a Linear(EMBED_DIM, 1) head on the elementwise |z_a - z_b|, the embedding space has no native metric, only the post-hoc weighted-L1 head ranks pairs. </w:t>
       </w:r>
       <w:r>
         <w:rPr>
@@ -606,7 +606,7 @@
           <w:rFonts w:ascii="Calibri" w:hAnsi="Calibri"/>
           <w:sz w:val="24"/>
         </w:rPr>
-        <w:t xml:space="preserve"> For contrastive, m sets the absolute scale of inter-class separation; too small and the loss collapses, too large and the loss can never reach zero. For triplet, α sets the minimum *relative* separation required between a positive and a negative; with L2-normalised embeddings (max d² = 4), the FaceNet default α = 0.2 was chosen by our K = 4 margin sweep. </w:t>
+        <w:t xml:space="preserve"> For contrastive, m sets the absolute scale of inter-class separation, too small and the loss collapses, too large and the loss can never reach zero. For triplet, α sets the minimum *relative* separation required between a positive and a negative, with L2-normalised embeddings (max d² = 4), the FaceNet default α = 0.2 was chosen by our K = 4 margin sweep. </w:t>
       </w:r>
       <w:r>
         <w:rPr>
@@ -621,7 +621,7 @@
           <w:rFonts w:ascii="Calibri" w:hAnsi="Calibri"/>
           <w:sz w:val="24"/>
         </w:rPr>
-        <w:t xml:space="preserve"> Random triplets are mostly trivial after a few epochs (most negatives are already at d &gt; d(a, p) + α and contribute zero gradient), so the model stops learning; mining selects informative triplets that still violate the margin.</w:t>
+        <w:t xml:space="preserve"> Random triplets are mostly trivial after a few epochs (most negatives are already at d &gt; d(a, p) + α and contribute zero gradient), so the model stops learning, mining selects informative triplets that still violate the margin.</w:t>
       </w:r>
     </w:p>
     <w:tbl>
@@ -1170,7 +1170,7 @@
           <w:rFonts w:ascii="Calibri" w:hAnsi="Calibri"/>
           <w:sz w:val="24"/>
         </w:rPr>
-        <w:t xml:space="preserve"> Going from Koch BCE → Contrastive → Triplet adds +0.075 and +0.143 test AUC respectively — the monotonic loss ordering predicted by H1 is confirmed. The Koch BCE baseline barely beats chance on N=20 one-shot (0.104 vs random 0.05), confirming that a learned scalar similarity head produces embeddings whose pairwise structure is weak. Triplet (semi) achieves 0.904 AUC; triplet (rand) sits at 0.914 on this seed — random tied or slightly beat semi-hard, contradicting H2. The likely cause is our strict-skip semi-hard implementation: for many anchors the window (d_ap, d_ap + α) is empty after a few epochs, so those triplets contribute no gradient; random sampling occasionally lands on a true hard negative and gets a full-strength update. The 3-seed mean for semi-hard is 0.894 ± 0.008 (Section 8), comfortably covering the random-triplet single-seed result. We interpret this as: mining is methodologically correct (and what FaceNet uses), but with strict-skip on a small dataset, the gradient sparsity neutralises the expected advantage.</w:t>
+        <w:t xml:space="preserve"> Going from Koch BCE → Contrastive → Triplet adds +0.075 and +0.143 test AUC respectively — the monotonic loss ordering predicted by H1 is confirmed. The Koch BCE baseline barely beats chance on N=20 one-shot (0.104 vs random 0.05), confirming that a learned scalar similarity head produces embeddings whose pairwise structure is weak. Triplet (semi) achieves 0.904 AUC, triplet (rand) sits at 0.914 on this seed — random tied or slightly beat semi-hard, contradicting H2. The likely cause is our strict-skip semi-hard implementation: for many anchors the window (d_ap, d_ap + α) is empty after a few epochs, so those triplets contribute no gradient, random sampling occasionally lands on a true hard negative and gets a full-strength update. The 3-seed mean for semi-hard is 0.894 ± 0.008 (Section 8), comfortably covering the random-triplet single-seed result. We interpret this as: mining is methodologically correct (and what FaceNet uses), but with strict-skip on a small dataset, the gradient sparsity neutralises the expected advantage.</w:t>
       </w:r>
     </w:p>
     <w:p>
@@ -1435,7 +1435,7 @@
           <w:rFonts w:ascii="Calibri" w:hAnsi="Calibri"/>
           <w:sz w:val="24"/>
         </w:rPr>
-        <w:t>Table 2: Parameter / MACs / FLOPs (thop on 1×1×105×105 for Koch, 1×3×112×112 for ResNet). Parameter difference: 4.3%, well inside the ±20% matching constraint. Koch has higher MACs per forward pass because of its larger 105×105 input and 10×10 first kernel; ResNet has more depth but smaller spatial footprint at 112×112.</w:t>
+        <w:t>Table 2: Parameter / MACs / FLOPs (thop on 1×1×105×105 for Koch, 1×3×112×112 for ResNet). Parameter difference: 4.3%, well inside the ±20% matching constraint. Koch has higher MACs per forward pass because of its larger 105×105 input and 10×10 first kernel, ResNet has more depth but smaller spatial footprint at 112×112.</w:t>
       </w:r>
     </w:p>
     <w:tbl>
@@ -1740,7 +1740,7 @@
           <w:rFonts w:ascii="Calibri" w:hAnsi="Calibri"/>
           <w:sz w:val="24"/>
         </w:rPr>
-        <w:t xml:space="preserve"> At matched parameter count and matched loss, Koch CNN matches or modestly beats ResNet-18 from scratch on every metric. Residual connectivity did NOT buy a measurable advantage on LFW-a at this scale. Plausible explanation: ~1,900 training identities with a median of 1 image each does not provide enough data to exploit the inductive bias residual blocks offer; the heavier first-conv stack in Koch happens to capture enough of the face-discriminative low-level structure. The result was robust across seeds (Section 8): Koch+triplet 0.894 ± 0.008 AUC vs ResNet+triplet 0.881 ± 0.005 AUC (a &gt;1σ separation), and ResNet showed larger seed variance on N-way one-shot (e.g., N=20 ±0.043 vs Koch's ±0.015). We would have predicted from the lectures that residual blocks ease optimisation on deeper networks — this is true in principle, but at 18 layers and small data, the optimisation advantage is not the bottleneck.</w:t>
+        <w:t xml:space="preserve"> At matched parameter count and matched loss, Koch CNN matches or modestly beats ResNet-18 from scratch on every metric. Residual connectivity did NOT buy a measurable advantage on LFW-a at this scale. Plausible explanation: ~1,900 training identities with a median of 1 image each does not provide enough data to exploit the inductive bias residual blocks offer, the heavier first-conv stack in Koch happens to capture enough of the face-discriminative low-level structure. The result was robust across seeds (Section 8): Koch+triplet 0.894 ± 0.008 AUC vs ResNet+triplet 0.881 ± 0.005 AUC (a &gt;1σ separation), and ResNet showed larger seed variance on N-way one-shot (e.g., N=20 ±0.043 vs Koch's ±0.015). We would have predicted from the lectures that residual blocks ease optimisation on deeper networks — this is true in principle, but at 18 layers and small data, the optimisation advantage is not the bottleneck.</w:t>
       </w:r>
     </w:p>
     <w:p>
@@ -1761,7 +1761,7 @@
           <w:rFonts w:ascii="Calibri" w:hAnsi="Calibri"/>
           <w:sz w:val="24"/>
         </w:rPr>
-        <w:t xml:space="preserve">Frozen ImageNet-pretrained ResNet-18 (final FC replaced with Identity, all parameters frozen, no fine-tuning). Embeddings are the raw 512-D backbone features; pairs scored by cosine similarity; same test pairs and one-shot episodes as Experiments 1 and 2. </w:t>
+        <w:t xml:space="preserve">Frozen ImageNet-pretrained ResNet-18 (final FC replaced with Identity, all parameters frozen, no fine-tuning). Embeddings are the raw 512-D backbone features, pairs scored by cosine similarity, same test pairs and one-shot episodes as Experiments 1 and 2. </w:t>
       </w:r>
       <w:r>
         <w:rPr>
@@ -2128,7 +2128,7 @@
                 <w:rFonts w:ascii="Calibri" w:hAnsi="Calibri"/>
                 <w:sz w:val="22"/>
               </w:rPr>
-              <w:t>−0.247</w:t>
+              <w:t>-0.247</w:t>
             </w:r>
           </w:p>
         </w:tc>
@@ -2228,7 +2228,7 @@
                 <w:rFonts w:ascii="Calibri" w:hAnsi="Calibri"/>
                 <w:sz w:val="22"/>
               </w:rPr>
-              <w:t>−1.134</w:t>
+              <w:t>-1.134</w:t>
             </w:r>
           </w:p>
         </w:tc>
@@ -2328,7 +2328,7 @@
                 <w:rFonts w:ascii="Calibri" w:hAnsi="Calibri"/>
                 <w:sz w:val="22"/>
               </w:rPr>
-              <w:t>−0.874</w:t>
+              <w:t>-0.874</w:t>
             </w:r>
           </w:p>
         </w:tc>
@@ -2428,7 +2428,7 @@
                 <w:rFonts w:ascii="Calibri" w:hAnsi="Calibri"/>
                 <w:sz w:val="22"/>
               </w:rPr>
-              <w:t>−0.949</w:t>
+              <w:t>-0.949</w:t>
             </w:r>
           </w:p>
         </w:tc>
@@ -2614,7 +2614,7 @@
           <w:rFonts w:ascii="Calibri" w:hAnsi="Calibri"/>
           <w:sz w:val="24"/>
         </w:rPr>
-        <w:t xml:space="preserve">; val_AUC = 0.908, test_AUC = 0.895). The val-AUC argmax across ALL single-seed candidates would have picked the random-triplet ablation (val_AUC = 0.924, test_AUC = 0.914); the assignment explicitly disqualifies random sampling as a triplet baseline (permitted only as an ablation), so we analyse the highest-val-AUC PERMITTED model instead. This keeps §5 and §7 consistent. Note that the 3-seed mean test AUC reported in §8 reverses this single-seed ranking: Koch+triplet (semi-hard) at 0.894 ± 0.008 beats ResNet-18+triplet at 0.881 ± 0.005. We retain the single-seed val-AUC selection rule here to avoid using the test set in any selection step; the embedding analysis is therefore on the val-AUC winner, while §5/§8/§11 use the multi-seed-mean winner. At ~1σ separation, the two embedding spaces are likely qualitatively similar (both are triplet semi-hard). 2D t-SNE of test-set embeddings over 25 sampled test identities (up to 8 images each) in Appendix Fig. A5 shows tight, well-separated clusters for most identities, with some clusters smearing into neighbours (consistent with the failure cases in §9). Intra-class vs inter-class L2 distance on the same 25-identity sample: intra mean = </w:t>
+        <w:t xml:space="preserve">, val_AUC = 0.908, test_AUC = 0.895). The val-AUC argmax across ALL single-seed candidates would have picked the random-triplet ablation (val_AUC = 0.924, test_AUC = 0.914), the assignment explicitly disqualifies random sampling as a triplet baseline (permitted only as an ablation), so we analyse the highest-val-AUC PERMITTED model instead. This keeps §5 and §7 consistent. Note that the 3-seed mean test AUC reported in §8 reverses this single-seed ranking: Koch+triplet (semi-hard) at 0.894 ± 0.008 beats ResNet-18+triplet at 0.881 ± 0.005. We retain the single-seed val-AUC selection rule here to avoid using the test set in any selection step, the embedding analysis is therefore on the val-AUC winner, while §5/§8/§11 use the multi-seed-mean winner. At ~1σ separation, the two embedding spaces are likely qualitatively similar (both are triplet semi-hard). 2D t-SNE of test-set embeddings over 25 sampled test identities (up to 8 images each) in Appendix Fig. A5 shows tight, well-separated clusters for most identities, with some clusters smearing into neighbours (consistent with the failure cases in §9). Intra-class vs inter-class L2 distance on the same 25-identity sample: intra mean = </w:t>
       </w:r>
       <w:r>
         <w:rPr>
@@ -2644,7 +2644,7 @@
           <w:rFonts w:ascii="Calibri" w:hAnsi="Calibri"/>
           <w:sz w:val="24"/>
         </w:rPr>
-        <w:t xml:space="preserve"> (n = 7,812). Inter-class mean is ~1.9× intra-class mean and the standard deviations are tight enough that the bulk of the distributions separate (histogram in Appendix Fig. A6), though the upper tail of intra and lower tail of inter overlap meaningfully — exactly the source of the residual verification errors (1 − AUC ≈ 0.10 on test).</w:t>
+        <w:t xml:space="preserve"> (n = 7,812). Inter-class mean is ~1.9× intra-class mean and the standard deviations are tight enough that the bulk of the distributions separate (histogram in Appendix Fig. A6), though the upper tail of intra and lower tail of inter overlap meaningfully — exactly the source of the residual verification errors (1 - AUC ≈ 0.10 on test).</w:t>
       </w:r>
     </w:p>
     <w:p>
@@ -3129,7 +3129,7 @@
           <w:rFonts w:ascii="Calibri" w:hAnsi="Calibri"/>
           <w:sz w:val="24"/>
         </w:rPr>
-        <w:t xml:space="preserve"> A longer LR schedule (cosine or step) could close the gap between Koch BCE and the metric losses; embedding dim 128 was chosen to match across backbones and could be raised to 256/512 — both choices would raise absolute AUC without necessarily changing the head-to-head ordering. Our semi-hard mining uses strict skip rather than softer alternatives (e.g., FaceNet's random-within-window or curriculum), which directly hurts H2 — under a different mining policy, semi-hard would likely beat random by a small but consistent margin. </w:t>
+        <w:t xml:space="preserve"> A longer LR schedule (cosine or step) could close the gap between Koch BCE and the metric losses, embedding dim 128 was chosen to match across backbones and could be raised to 256/512 — both choices would raise absolute AUC without necessarily changing the head-to-head ordering. Our semi-hard mining uses strict skip rather than softer alternatives (e.g., FaceNet's random-within-window or curriculum), which directly hurts H2 — under a different mining policy, semi-hard would likely beat random by a small but consistent margin. </w:t>
       </w:r>
       <w:r>
         <w:rPr>
@@ -3159,7 +3159,7 @@
           <w:rFonts w:ascii="Calibri" w:hAnsi="Calibri"/>
           <w:sz w:val="24"/>
         </w:rPr>
-        <w:t xml:space="preserve"> Only 3 seeds for the best per-experiment model; the standard deviations are themselves imprecisely estimated. Random-triplet was reported single-seed; if multi-seeded its mean might land below semi-hard. Early stopping at patience = 15 epochs might still curtail a slow second-wind for triplet semi-hard — extending patience would be the next ablation. All thresholds are chosen on validation, never on test.</w:t>
+        <w:t xml:space="preserve"> Only 3 seeds for the best per-experiment model, the standard deviations are themselves imprecisely estimated. Random-triplet was reported single-seed, if multi-seeded its mean might land below semi-hard. Early stopping at patience = 15 epochs might still curtail a slow second-wind for triplet semi-hard — extending patience would be the next ablation. All thresholds are chosen on validation, never on test.</w:t>
       </w:r>
     </w:p>
     <w:p>
@@ -3191,7 +3191,7 @@
           <w:rFonts w:ascii="Calibri" w:hAnsi="Calibri"/>
           <w:sz w:val="24"/>
         </w:rPr>
-        <w:t xml:space="preserve"> Koch BCE → Koch+triplet is +0.218 AUC; Koch+triplet → ResNet+triplet is −0.013 AUC across 3 seeds. The loss/sampling axis dominates by an order of magnitude.</w:t>
+        <w:t xml:space="preserve"> Koch BCE → Koch+triplet is +0.218 AUC, Koch+triplet → ResNet+triplet is -0.013 AUC across 3 seeds. The loss/sampling axis dominates by an order of magnitude.</w:t>
       </w:r>
     </w:p>
     <w:p>
@@ -3329,7 +3329,7 @@
           <w:i/>
           <w:sz w:val="22"/>
         </w:rPr>
-        <w:t>Fig. A1 — Distribution of images per training identity. Heavy tail; median = 1.</w:t>
+        <w:t>Fig. A1 — Distribution of images per training identity. Heavy tail, median = 1.</w:t>
       </w:r>
     </w:p>
     <w:p>
@@ -3381,7 +3381,7 @@
           <w:i/>
           <w:sz w:val="22"/>
         </w:rPr>
-        <w:t>Fig. A2 — Experiment 1: ROC overlay (all four losses) on the left; training loss (middle) and validation loss (right) for the same four runs. Different losses live on different scales — the shapes are comparable, the absolute magnitudes across rows are not.</w:t>
+        <w:t>Fig. A2 — Experiment 1: ROC overlay (all four losses) on the left, training loss (middle) and validation loss (right) for the same four runs. Different losses live on different scales — the shapes are comparable, the absolute magnitudes across rows are not.</w:t>
       </w:r>
     </w:p>
     <w:p>
@@ -3537,7 +3537,7 @@
           <w:i/>
           <w:sz w:val="22"/>
         </w:rPr>
-        <w:t>Fig. A5 — 2D t-SNE of best-model test embeddings, 25 sampled identities × up to 8 images per identity. Legend (right) names each identity by its LFW folder name. Most identities form tight clusters; the few smeared clusters correspond to the failure cases.</w:t>
+        <w:t>Fig. A5 — 2D t-SNE of best-model test embeddings, 25 sampled identities × up to 8 images per identity. Legend (right) names each identity by its LFW folder name. Most identities form tight clusters, the few smeared clusters correspond to the failure cases.</w:t>
       </w:r>
     </w:p>
     <w:p>
@@ -3589,7 +3589,7 @@
           <w:i/>
           <w:sz w:val="22"/>
         </w:rPr>
-        <w:t>Fig. A6 — Intra- vs inter-class L2 distance distributions (best model). Inter-class mean is well above intra-class mean; tail overlap is the source of test errors.</w:t>
+        <w:t>Fig. A6 — Intra- vs inter-class L2 distance distributions (best model). Inter-class mean is well above intra-class mean, tail overlap is the source of test errors.</w:t>
       </w:r>
     </w:p>
     <w:p>
@@ -3745,7 +3745,7 @@
           <w:i/>
           <w:sz w:val="22"/>
         </w:rPr>
-        <w:t>Fig. A9 — Multi-seed validation. One panel per metric; bar = mean across SEEDS = (0, 1, 2), error bar = ±1 std, black dots = individual seeds, red × = the SEED = 42 headline value reported in the body. Koch+triplet beats ResNet-18+triplet on every metric and shows lower seed variance.</w:t>
+        <w:t>Fig. A9 — Multi-seed validation. One panel per metric, bar = mean across SEEDS = (0, 1, 2), error bar = ±1 std, black dots = individual seeds, red × = the SEED = 42 headline value reported in the body. Koch+triplet beats ResNet-18+triplet on every metric and shows lower seed variance.</w:t>
       </w:r>
     </w:p>
     <w:sectPr>

</xml_diff>

<commit_message>
add exapline about epocs and early stoping
</commit_message>
<xml_diff>
--- a/Assignment2/Report.docx
+++ b/Assignment2/Report.docx
@@ -112,11 +112,58 @@
       <w:r>
         <w:rPr>
           <w:b/>
+          <w:bCs/>
         </w:rPr>
-        <w:t>Budget metric</w:t>
-      </w:r>
-      <w:r>
-        <w:t xml:space="preserve">: same epoch ceiling (EPOCHS = 60) and same early-stop patience (15 epochs without val-AUC improvement) for every configuration in Experiments 1 and 2. We adopted epochs rather than FLOPs because the input pipeline and image size are identical across configurations, making epochs a fair proxy, early stopping prevents fast configs from being penalised by an unnecessarily long ceiling and prevents slow configs from reading as 'diverging' when they were just under-trained. </w:t>
+        <w:t>Budget metric:</w:t>
+      </w:r>
+      <w:r>
+        <w:rPr>
+          <w:b/>
+        </w:rPr>
+        <w:t xml:space="preserve"> </w:t>
+      </w:r>
+      <w:r>
+        <w:rPr>
+          <w:bCs/>
+        </w:rPr>
+        <w:t xml:space="preserve">All configurations in Experiments 1 and 2 were trained using the same maximum epoch limit (EPOCHS = 60) and the same early stopping criterion (patience of 15 epochs without improvement in validation AUC). These values were chosen based on the findings of </w:t>
+      </w:r>
+      <w:r>
+        <w:rPr>
+          <w:bCs/>
+          <w:i/>
+          <w:iCs/>
+        </w:rPr>
+        <w:t>“An Empirical Study on the Correlation between Early Stopping Patience and Epochs in Deep Learning”</w:t>
+      </w:r>
+      <w:r>
+        <w:rPr>
+          <w:bCs/>
+        </w:rPr>
+        <w:t xml:space="preserve"> by Bootan M. Hussein et al., which evaluated different patience values for CNN training. A relatively high epoch ceiling was selected due to the complexity of the face verification task.</w:t>
+      </w:r>
+      <w:r>
+        <w:rPr>
+          <w:b/>
+        </w:rPr>
+        <w:t xml:space="preserve"> </w:t>
+      </w:r>
+      <w:r>
+        <w:rPr>
+          <w:bCs/>
+        </w:rPr>
+        <w:t>E</w:t>
+      </w:r>
+      <w:r>
+        <w:t xml:space="preserve">arly stopping prevents fast configs from being penalised by an unnecessarily long ceiling and prevents slow configs from reading as 'diverging' when they </w:t>
+      </w:r>
+      <w:proofErr w:type="gramStart"/>
+      <w:r>
+        <w:t>were</w:t>
+      </w:r>
+      <w:proofErr w:type="gramEnd"/>
+      <w:r>
+        <w:t xml:space="preserve"> just under-trained. </w:t>
       </w:r>
     </w:p>
     <w:p>
@@ -220,6 +267,7 @@
         <w:rPr>
           <w:b/>
         </w:rPr>
+        <w:lastRenderedPageBreak/>
         <w:t>Images per identity (train)</w:t>
       </w:r>
       <w:r>
@@ -240,11 +288,7 @@
         <w:t>Validation split.</w:t>
       </w:r>
       <w:r>
-        <w:t xml:space="preserve"> We carve ~10% of training identities (not pairs) into a held-out validation fold so identity-disjointness with train is preserved. Naively filtering the existing negative-pair list </w:t>
-      </w:r>
-      <w:r>
-        <w:lastRenderedPageBreak/>
-        <w:t xml:space="preserve">with this rule retains only ~val_frac² ≈ 1% of negatives </w:t>
+        <w:t xml:space="preserve"> We carve ~10% of training identities (not pairs) into a held-out validation fold so identity-disjointness with train is preserved. Naively filtering the existing negative-pair list with this rule retains only ~val_frac² ≈ 1% of negatives </w:t>
       </w:r>
       <w:r>
         <w:t>-</w:t>
@@ -351,7 +395,7 @@
         <w:t>How parameters were chosen.</w:t>
       </w:r>
       <w:r>
-        <w:t xml:space="preserve"> With K = 4 trials per configuration available, we spent the budget on the loss margins, which we judged (and the literature confirms) have the largest single effect on training stability for metric losses. Adam was fixed at lr = 1e-3 with no schedule. Margin grids: contrastive {0.5, 1.0, 1.5, 2.0} on L2-normalised embeddings (effective range [0, 2]), triplet {0.1, 0.2, 0.3, 0.5} around the FaceNet default α = 0.2. Each trial ran for EPOCHS/3 = 20 epochs (short-schedule sweep), and the margin with the best validation verification accuracy was retrained for the full budget. The sweep chose </w:t>
+        <w:t xml:space="preserve"> With K = 4 trials per configuration available, we spent the budget on the loss margins, which we judged (and the literature confirms) have the largest single effect on training stability for metric losses. Adam was fixed at lr = 1e-3 with no schedule. Margin grids: contrastive {0.5, 1.0, 1.5, 2.0} on L2-normalised embeddings (effective range [0, 2]), triplet {0.1, 0.2, 0.3, 0.5} around the FaceNet default α = 0.2. Each trial ran for EPOCHS/3 = 20 (short-schedule sweep), and the margin with the best validation verification accuracy was retrained for the full budget. The sweep chose </w:t>
       </w:r>
       <w:r>
         <w:rPr>
@@ -391,6 +435,7 @@
         <w:rPr>
           <w:b/>
         </w:rPr>
+        <w:lastRenderedPageBreak/>
         <w:t>Semi-hard mining selection.</w:t>
       </w:r>
       <w:r>
@@ -427,7 +472,6 @@
         <w:rPr>
           <w:b/>
         </w:rPr>
-        <w:lastRenderedPageBreak/>
         <w:t>Validation negatives.</w:t>
       </w:r>
       <w:r>
@@ -559,7 +603,14 @@
         <w:rPr>
           <w:b/>
         </w:rPr>
-        <w:t>Role of margin.</w:t>
+        <w:t xml:space="preserve">Role </w:t>
+      </w:r>
+      <w:r>
+        <w:rPr>
+          <w:b/>
+        </w:rPr>
+        <w:lastRenderedPageBreak/>
+        <w:t>of margin.</w:t>
       </w:r>
       <w:r>
         <w:t xml:space="preserve"> For contrastive, m sets the absolute scale of inter-class separation, too small and the loss collapses, too large and the loss can never reach zero. For triplet, α sets the minimum *relative* separation required between a positive and a negative, with L2-normalised embeddings (max d² = 4), the FaceNet default α = 0.2 was chosen by our K = 4 margin sweep. </w:t>
@@ -571,11 +622,7 @@
         <w:t>Why mining matters.</w:t>
       </w:r>
       <w:r>
-        <w:t xml:space="preserve"> Random triplets are mostly trivial after a few epochs (most negatives are </w:t>
-      </w:r>
-      <w:r>
-        <w:lastRenderedPageBreak/>
-        <w:t>already at d &gt; d(a, p) + α and contribute zero gradient), so the model stops learning, mining selects informative triplets that still violate the margin.</w:t>
+        <w:t xml:space="preserve"> Random triplets are mostly trivial after a few epochs (most negatives are already at d &gt; d(a, p) + α and contribute zero gradient), so the model stops learning, mining selects informative triplets that still violate the margin.</w:t>
       </w:r>
     </w:p>
     <w:tbl>
@@ -963,9 +1010,15 @@
           <w:p>
             <w:pPr>
               <w:cnfStyle w:val="000000100000" w:firstRow="0" w:lastRow="0" w:firstColumn="0" w:lastColumn="0" w:oddVBand="0" w:evenVBand="0" w:oddHBand="1" w:evenHBand="0" w:firstRowFirstColumn="0" w:firstRowLastColumn="0" w:lastRowFirstColumn="0" w:lastRowLastColumn="0"/>
+              <w:rPr>
+                <w:b/>
+                <w:bCs/>
+              </w:rPr>
             </w:pPr>
             <w:r>
               <w:rPr>
+                <w:b/>
+                <w:bCs/>
                 <w:sz w:val="22"/>
               </w:rPr>
               <w:t>0.834</w:t>
@@ -1094,9 +1147,15 @@
           <w:p>
             <w:pPr>
               <w:cnfStyle w:val="000000010000" w:firstRow="0" w:lastRow="0" w:firstColumn="0" w:lastColumn="0" w:oddVBand="0" w:evenVBand="0" w:oddHBand="0" w:evenHBand="1" w:firstRowFirstColumn="0" w:firstRowLastColumn="0" w:lastRowFirstColumn="0" w:lastRowLastColumn="0"/>
+              <w:rPr>
+                <w:b/>
+                <w:bCs/>
+              </w:rPr>
             </w:pPr>
             <w:r>
               <w:rPr>
+                <w:b/>
+                <w:bCs/>
                 <w:sz w:val="22"/>
               </w:rPr>
               <w:t>0.914</w:t>
@@ -1350,7 +1409,14 @@
               <w:rPr>
                 <w:sz w:val="22"/>
               </w:rPr>
-              <w:t>Koch CNN (slimmed)</w:t>
+              <w:t xml:space="preserve">Koch CNN </w:t>
+            </w:r>
+            <w:r>
+              <w:rPr>
+                <w:sz w:val="22"/>
+              </w:rPr>
+              <w:lastRenderedPageBreak/>
+              <w:t>(slimmed)</w:t>
             </w:r>
           </w:p>
         </w:tc>
@@ -1366,6 +1432,7 @@
               <w:rPr>
                 <w:sz w:val="22"/>
               </w:rPr>
+              <w:lastRenderedPageBreak/>
               <w:t>10,764,224</w:t>
             </w:r>
           </w:p>
@@ -1505,11 +1572,7 @@
     </w:tbl>
     <w:p>
       <w:r>
-        <w:t xml:space="preserve">Table 2: Parameter / MACs / FLOPs (thop on 1×1×105×105 for Koch, 1×3×112×112 for ResNet). Parameter difference: 4.3%, well inside the ±20% matching constraint. Koch has higher MACs </w:t>
-      </w:r>
-      <w:r>
-        <w:lastRenderedPageBreak/>
-        <w:t>per forward pass because of its larger 105×105 input and 10×10 first kernel, ResNet has more depth but smaller spatial footprint at 112×112.</w:t>
+        <w:t>Table 2: Parameter / MACs / FLOPs (thop on 1×1×105×105 for Koch, 1×3×112×112 for ResNet). Parameter difference: 4.3%, well inside the ±20% matching constraint. Koch has higher MACs per forward pass because of its larger 105×105 input and 10×10 first kernel, ResNet has more depth but smaller spatial footprint at 112×112.</w:t>
       </w:r>
     </w:p>
     <w:tbl>
@@ -1883,13 +1946,16 @@
         <w:t xml:space="preserve">Frozen ImageNet-pretrained ResNet-18 (final FC replaced with Identity, all parameters frozen, no fine-tuning). Embeddings are the raw 512-D backbone features, pairs scored by cosine similarity, same test pairs and one-shot episodes as Experiments 1 and 2. </w:t>
       </w:r>
       <w:r>
+        <w:br/>
+      </w:r>
+      <w:r>
         <w:rPr>
-          <w:b/>
+          <w:bCs/>
         </w:rPr>
-        <w:t>Caveat on the input pipeline</w:t>
-      </w:r>
-      <w:r>
-        <w:t xml:space="preserve">: LFW-a is provided as single-channel images and ImageNet's ResNet-18 expects 3-channel RGB normalised with ImageNet mean/std. We replicate the grayscale channel three times and apply ImageNet normalisation, which produces a domain mismatch (ImageNet was trained on RGB photos) that likely lowers the frozen-baseline ceiling. Resampling to 112×112 (not 224×224) further moves it off the ImageNet distribution. Test AUC = </w:t>
+        <w:t>One caveat is that</w:t>
+      </w:r>
+      <w:r>
+        <w:t xml:space="preserve"> LFW-a is provided as single-channel images and ImageNet's ResNet-18 expects 3-channel RGB normalised with ImageNet mean/std. We replicate the grayscale channel three times and apply ImageNet normalisation, which produces a domain mismatch (ImageNet was trained on RGB photos) that likely lowers the frozen-baseline ceiling. Resampling to 112×112 (not 224×224) further moves it off the ImageNet distribution. Test AUC = </w:t>
       </w:r>
       <w:r>
         <w:rPr>
@@ -1902,37 +1968,38 @@
       </w:r>
     </w:p>
     <w:p>
-      <w:r>
+      <w:pPr>
         <w:rPr>
           <w:b/>
         </w:rPr>
-        <w:t>Finding (confirms H4).</w:t>
-      </w:r>
-      <w:r>
-        <w:t xml:space="preserve"> The frozen baseline sits between the Koch-paper baseline (AUC 0.686) and every trained metric-learning model (AUC ≥ 0.895). Pretrained ImageNet features are not competitive with trained metric learning on faces </w:t>
-      </w:r>
-      <w:r>
-        <w:t>-</w:t>
-      </w:r>
-      <w:r>
-        <w:t xml:space="preserve"> but they are a strong sanity floor that the literal Koch reproduction fails to clear. </w:t>
-      </w:r>
+      </w:pPr>
       <w:r>
         <w:rPr>
           <w:b/>
         </w:rPr>
-        <w:t>We report this honestly as the assignment requires</w:t>
-      </w:r>
-      <w:r>
-        <w:t xml:space="preserve">: Koch BCE on L1 distance (AUC 0.686) does not beat the frozen ImageNet baseline (AUC 0.763), so the paper's original setup, evaluated faithfully at matched compute and dataset, is </w:t>
-      </w:r>
-      <w:r>
         <w:lastRenderedPageBreak/>
-        <w:t xml:space="preserve">dominated by a zero-training feature extractor trained on an unrelated task. This is precisely the kind of finding the assignment asked us not to hide. </w:t>
+        <w:t>Finding (confirms H4).</w:t>
+      </w:r>
+      <w:r>
+        <w:t xml:space="preserve"> The frozen baseline sits between the Koch-paper baseline (AUC 0.686) and every trained metric-learning model (AUC ≥ 0.895). Pretrained ImageNet features are not competitive with trained metric learning on faces </w:t>
+      </w:r>
+      <w:r>
+        <w:t>-</w:t>
+      </w:r>
+      <w:r>
+        <w:t xml:space="preserve"> but they are a strong sanity floor that the literal Koch reproduction fails to clear. </w:t>
+      </w:r>
+    </w:p>
+    <w:p>
+      <w:r>
+        <w:t xml:space="preserve">Koch BCE on L1 distance (AUC 0.686) does not beat the frozen ImageNet baseline (AUC 0.763), so the paper's original setup, evaluated faithfully at matched compute and dataset, is dominated by a zero-training feature extractor trained on an unrelated task. </w:t>
+      </w:r>
+      <w:r>
+        <w:br/>
       </w:r>
       <w:r>
         <w:rPr>
-          <w:b/>
+          <w:bCs/>
         </w:rPr>
         <w:t>No multi-seed re-run is reported for this baseline</w:t>
       </w:r>
@@ -2797,16 +2864,50 @@
         <w:t>Embedding analysis for the best permitted model</w:t>
       </w:r>
       <w:r>
-        <w:t xml:space="preserve"> (selected by validation AUC over the assignment-permitted baselines: </w:t>
-      </w:r>
-      <w:r>
-        <w:rPr>
-          <w:b/>
-        </w:rPr>
-        <w:t>ResNet-18 (scratch)</w:t>
-      </w:r>
-      <w:r>
-        <w:t xml:space="preserve">, val_AUC = 0.908, test_AUC = 0.895). The val-AUC argmax across ALL single-seed candidates would have picked the random-triplet ablation (val_AUC = 0.924, test_AUC = 0.914), the assignment explicitly disqualifies random sampling as a triplet baseline (permitted only as an ablation), so we analyse the highest-val-AUC PERMITTED model instead. This keeps §5 and §7 consistent. Note that the 3-seed mean test AUC reported in §8 reverses this single-seed ranking: Koch+triplet (semi-hard) at 0.894 ± 0.008 beats ResNet-18+triplet at 0.881 ± 0.005. We retain the single-seed val-AUC selection rule here to avoid using the test set in any selection step, the embedding analysis is therefore on the val-AUC winner, while §5/§8/§11 use the multi-seed-mean winner. At ~1σ separation, the two embedding spaces are likely qualitatively similar (both are triplet semi-hard). 2D t-SNE of test-set embeddings over 25 sampled test identities (up to 8 images each) in Appendix Fig. A5 shows tight, well-separated clusters for most identities, with some clusters smearing into neighbours (consistent with the failure cases in §9). Intra-class vs inter-class L2 distance on the same 25-identity sample: intra mean = </w:t>
+        <w:t xml:space="preserve"> (selected by validation AUC over the assignment-permitted baselines</w:t>
+      </w:r>
+      <w:r>
+        <w:t>: ResNet-18 (scratch),</w:t>
+      </w:r>
+      <w:r>
+        <w:t xml:space="preserve"> val_AUC = 0.908, test_AUC = 0.895). The val-AUC argmax across ALL single-seed candidates would have picked the random-triplet ablation (val_AUC = 0.924, test_AUC = 0.914), the assignment explicitly disqualifies random sampling as a triplet baseline (permitted only as an ablation), so we </w:t>
+      </w:r>
+      <w:proofErr w:type="spellStart"/>
+      <w:r>
+        <w:t>analyse</w:t>
+      </w:r>
+      <w:proofErr w:type="spellEnd"/>
+      <w:r>
+        <w:t xml:space="preserve"> the highest-</w:t>
+      </w:r>
+      <w:proofErr w:type="spellStart"/>
+      <w:r>
+        <w:t>val</w:t>
+      </w:r>
+      <w:proofErr w:type="spellEnd"/>
+      <w:r>
+        <w:t xml:space="preserve">-AUC </w:t>
+      </w:r>
+      <w:r>
+        <w:t>permitted</w:t>
+      </w:r>
+      <w:r>
+        <w:t xml:space="preserve"> model instead. This keeps </w:t>
+      </w:r>
+      <w:proofErr w:type="gramStart"/>
+      <w:r>
+        <w:t>section</w:t>
+      </w:r>
+      <w:proofErr w:type="gramEnd"/>
+      <w:r>
+        <w:t xml:space="preserve"> </w:t>
+      </w:r>
+      <w:r>
+        <w:t>5 and 7 consistent. Note that the 3-seed mean test AUC reported in §8 reverses this single-seed ranking: Koch+triplet (semi-hard) at 0.894 ± 0.008 beats ResNet-18+triplet at 0.881 ± 0.005. We retain the single-seed val-AUC selection rule here to avoid using the test set in any selection step, the embedding analysis is therefore on the val-AUC winner, while §5/§8/§11 use the multi-seed-mean winner. At ~1σ separation, the two embedding spaces are likely qualitatively similar (both are triplet semi-hard). 2D t-SNE of test-</w:t>
+      </w:r>
+      <w:r>
+        <w:lastRenderedPageBreak/>
+        <w:t xml:space="preserve">set embeddings over 25 sampled test identities (up to 8 images each) in Appendix Fig. A5 shows tight, well-separated clusters for most identities, with some clusters smearing into neighbours (consistent with the failure cases in §9). Intra-class vs inter-class L2 distance on the same 25-identity sample: intra mean = </w:t>
       </w:r>
       <w:r>
         <w:rPr>
@@ -2824,11 +2925,7 @@
         <w:t>1.355 ± 0.355</w:t>
       </w:r>
       <w:r>
-        <w:t xml:space="preserve"> (n = 7,812). Inter-class mean is ~1.9× intra-class mean and the standard deviations are tight enough that the bulk of the distributions separate (histogram in Appendix Fig. A6), though the upper tail of intra </w:t>
-      </w:r>
-      <w:r>
-        <w:lastRenderedPageBreak/>
-        <w:t xml:space="preserve">and lower tail of inter overlap meaningfully </w:t>
+        <w:t xml:space="preserve"> (n = 7,812). Inter-class mean is ~1.9× intra-class mean and the standard deviations are tight enough that the bulk of the distributions separate (histogram in Appendix Fig. A6), though the upper tail of intra and lower tail of inter overlap meaningfully </w:t>
       </w:r>
       <w:r>
         <w:t>-</w:t>
@@ -3366,6 +3463,7 @@
         <w:rPr>
           <w:b/>
         </w:rPr>
+        <w:lastRenderedPageBreak/>
         <w:t>False reject 3</w:t>
       </w:r>
       <w:r>
@@ -3398,11 +3496,7 @@
         <w:t>What would change our conclusions.</w:t>
       </w:r>
       <w:r>
-        <w:t xml:space="preserve"> A longer LR schedule (cosine or step) could close the gap between Koch BCE and the metric losses, embedding dim 128 was chosen to match across </w:t>
-      </w:r>
-      <w:r>
-        <w:lastRenderedPageBreak/>
-        <w:t xml:space="preserve">backbones and could be raised to 256/512 </w:t>
+        <w:t xml:space="preserve"> A longer LR schedule (cosine or step) could close the gap between Koch BCE and the metric losses, embedding dim 128 was chosen to match across backbones and could be raised to 256/512 </w:t>
       </w:r>
       <w:r>
         <w:t>-</w:t>
@@ -3423,6 +3517,9 @@
       </w:r>
       <w:r>
         <w:t xml:space="preserve"> under a different mining policy, semi-hard would likely beat random by a small but consistent margin. </w:t>
+      </w:r>
+      <w:r>
+        <w:br/>
       </w:r>
       <w:r>
         <w:rPr>
@@ -3446,6 +3543,9 @@
       <w:proofErr w:type="gramEnd"/>
       <w:r>
         <w:t xml:space="preserve"> celebrity faces. </w:t>
+      </w:r>
+      <w:r>
+        <w:br/>
       </w:r>
       <w:r>
         <w:rPr>

</xml_diff>